<commit_message>
add a separed list inside skills , update template, update export docx
</commit_message>
<xml_diff>
--- a/cv_reader/templates/CV_template.docx
+++ b/cv_reader/templates/CV_template.docx
@@ -460,19 +460,150 @@
         </w:rPr>
         <w:t>Education_title}}</w:t>
       </w:r>
+    </w:p>
+    <w:p>
+      <w:pPr>
+        <w:pStyle w:val="Default"/>
+        <w:tabs>
+          <w:tab w:val="left" w:pos="560"/>
+          <w:tab w:val="left" w:pos="1120"/>
+          <w:tab w:val="left" w:pos="1680"/>
+          <w:tab w:val="left" w:pos="2240"/>
+          <w:tab w:val="left" w:pos="2800"/>
+          <w:tab w:val="left" w:pos="3360"/>
+          <w:tab w:val="left" w:pos="3920"/>
+          <w:tab w:val="left" w:pos="4480"/>
+          <w:tab w:val="left" w:pos="5040"/>
+          <w:tab w:val="left" w:pos="5600"/>
+          <w:tab w:val="left" w:pos="6160"/>
+          <w:tab w:val="left" w:pos="6720"/>
+          <w:tab w:val="left" w:pos="6740"/>
+          <w:tab w:val="left" w:pos="6760"/>
+          <w:tab w:val="left" w:pos="6780"/>
+          <w:tab w:val="left" w:pos="6800"/>
+          <w:tab w:val="left" w:pos="6820"/>
+          <w:tab w:val="left" w:pos="6840"/>
+          <w:tab w:val="left" w:pos="6860"/>
+          <w:tab w:val="left" w:pos="6880"/>
+          <w:tab w:val="left" w:pos="6900"/>
+          <w:tab w:val="left" w:pos="6920"/>
+          <w:tab w:val="left" w:pos="6940"/>
+          <w:tab w:val="left" w:pos="6960"/>
+          <w:tab w:val="left" w:pos="6980"/>
+          <w:tab w:val="left" w:pos="7000"/>
+          <w:tab w:val="left" w:pos="7020"/>
+          <w:tab w:val="left" w:pos="7040"/>
+          <w:tab w:val="left" w:pos="7060"/>
+          <w:tab w:val="left" w:pos="7080"/>
+          <w:tab w:val="left" w:pos="7100"/>
+          <w:tab w:val="left" w:pos="7120"/>
+          <w:tab w:val="left" w:pos="7140"/>
+          <w:tab w:val="left" w:pos="7160"/>
+          <w:tab w:val="left" w:pos="7180"/>
+          <w:tab w:val="left" w:pos="7200"/>
+          <w:tab w:val="left" w:pos="7220"/>
+          <w:tab w:val="left" w:pos="7240"/>
+          <w:tab w:val="left" w:pos="7260"/>
+          <w:tab w:val="left" w:pos="7280"/>
+          <w:tab w:val="left" w:pos="7300"/>
+          <w:tab w:val="left" w:pos="7320"/>
+          <w:tab w:val="left" w:pos="7340"/>
+          <w:tab w:val="left" w:pos="7360"/>
+          <w:tab w:val="left" w:pos="7380"/>
+          <w:tab w:val="left" w:pos="7400"/>
+          <w:tab w:val="left" w:pos="7420"/>
+          <w:tab w:val="left" w:pos="7440"/>
+          <w:tab w:val="left" w:pos="7460"/>
+          <w:tab w:val="left" w:pos="7480"/>
+          <w:tab w:val="left" w:pos="7500"/>
+          <w:tab w:val="left" w:pos="7520"/>
+          <w:tab w:val="left" w:pos="7540"/>
+          <w:tab w:val="left" w:pos="7560"/>
+          <w:tab w:val="left" w:pos="7580"/>
+          <w:tab w:val="left" w:pos="7600"/>
+          <w:tab w:val="left" w:pos="7620"/>
+          <w:tab w:val="left" w:pos="7640"/>
+          <w:tab w:val="left" w:pos="7660"/>
+          <w:tab w:val="left" w:pos="7680"/>
+          <w:tab w:val="left" w:pos="7700"/>
+          <w:tab w:val="left" w:pos="7720"/>
+          <w:tab w:val="left" w:pos="7740"/>
+          <w:tab w:val="left" w:pos="7760"/>
+        </w:tabs>
+        <w:spacing w:line="240" w:lineRule="auto"/>
+        <w:jc w:val="both"/>
+        <w:rPr>
+          <w:rFonts w:ascii="Avenir Next Regular" w:cs="Avenir Next Regular" w:hAnsi="Avenir Next Regular" w:eastAsia="Avenir Next Regular"/>
+          <w:lang w:val="en-US"/>
+        </w:rPr>
+      </w:pPr>
       <w:r>
         <w:rPr>
-          <w:rFonts w:ascii="Arial Unicode MS" w:cs="Arial Unicode MS" w:hAnsi="Arial Unicode MS" w:eastAsia="Arial Unicode MS" w:hint="eastAsia"/>
+          <w:rFonts w:ascii="Calibri" w:hAnsi="Calibri"/>
+          <w:outline w:val="0"/>
+          <w:color w:val="404040"/>
+          <w:sz w:val="22"/>
+          <w:szCs w:val="22"/>
+          <w:u w:color="404040"/>
+          <w:rtl w:val="0"/>
+          <w:lang w:val="en-US"/>
+          <w14:textFill>
+            <w14:solidFill>
+              <w14:srgbClr w14:val="404040"/>
+            </w14:solidFill>
+          </w14:textFill>
+        </w:rPr>
+        <w:t>{{EDUCATION}}</w:t>
+      </w:r>
+    </w:p>
+    <w:p>
+      <w:pPr>
+        <w:pStyle w:val="Heading"/>
+        <w:tabs>
+          <w:tab w:val="left" w:pos="400"/>
+          <w:tab w:val="left" w:pos="800"/>
+          <w:tab w:val="left" w:pos="1200"/>
+          <w:tab w:val="left" w:pos="1600"/>
+          <w:tab w:val="left" w:pos="2000"/>
+          <w:tab w:val="left" w:pos="2400"/>
+          <w:tab w:val="left" w:pos="2800"/>
+          <w:tab w:val="left" w:pos="3200"/>
+          <w:tab w:val="left" w:pos="3600"/>
+          <w:tab w:val="left" w:pos="4000"/>
+          <w:tab w:val="left" w:pos="4400"/>
+          <w:tab w:val="left" w:pos="4800"/>
+          <w:tab w:val="left" w:pos="5200"/>
+          <w:tab w:val="left" w:pos="5600"/>
+          <w:tab w:val="left" w:pos="6000"/>
+          <w:tab w:val="left" w:pos="6400"/>
+          <w:tab w:val="left" w:pos="6800"/>
+          <w:tab w:val="left" w:pos="7200"/>
+          <w:tab w:val="left" w:pos="7600"/>
+          <w:tab w:val="left" w:pos="8000"/>
+          <w:tab w:val="left" w:pos="8400"/>
+          <w:tab w:val="left" w:pos="8800"/>
+          <w:tab w:val="left" w:pos="9200"/>
+          <w:tab w:val="left" w:pos="9472"/>
+        </w:tabs>
+        <w:rPr>
+          <w:rFonts w:ascii="Avenir Next Demi Bold" w:cs="Avenir Next Demi Bold" w:hAnsi="Avenir Next Demi Bold" w:eastAsia="Avenir Next Demi Bold"/>
           <w:b w:val="0"/>
           <w:bCs w:val="0"/>
-          <w:i w:val="0"/>
-          <w:iCs w:val="0"/>
+          <w:sz w:val="24"/>
+          <w:szCs w:val="24"/>
+        </w:rPr>
+      </w:pPr>
+      <w:r>
+        <w:rPr>
+          <w:rFonts w:ascii="Avenir Next Demi Bold" w:hAnsi="Avenir Next Demi Bold"/>
+          <w:b w:val="0"/>
+          <w:bCs w:val="0"/>
           <w:sz w:val="24"/>
           <w:szCs w:val="24"/>
           <w:rtl w:val="0"/>
           <w:lang w:val="en-US"/>
         </w:rPr>
-        <w:t>🔗</w:t>
+        <w:t>{{Projects_title}}</w:t>
       </w:r>
     </w:p>
     <w:p>
@@ -567,7 +698,7 @@
             </w14:solidFill>
           </w14:textFill>
         </w:rPr>
-        <w:t>{{EDUCATION}}</w:t>
+        <w:t>{{PROJECTS}}</w:t>
       </w:r>
     </w:p>
     <w:p>
@@ -800,7 +931,6 @@
           <w:sz w:val="22"/>
           <w:szCs w:val="22"/>
           <w:u w:color="404040"/>
-          <w:lang w:val="en-US"/>
           <w14:textFill>
             <w14:solidFill>
               <w14:srgbClr w14:val="404040"/>

</xml_diff>